<commit_message>
tidy the reference list and caption styles
The Knapen entry was the only one whose journal title was not italicised
and the only one with a hyphen rather than an en dash in its page range.

Captions came in four styles: bold label with roman title for Figures 1
to 4, bold-italic for Table 1, and fully bold for the appendix figures and
Table B.1. All nine now use a bold label and a roman title.

Also replaced the five surviving straight apostrophes.
</commit_message>
<xml_diff>
--- a/paper/paper_submission_2026-08-13.docx
+++ b/paper/paper_submission_2026-08-13.docx
@@ -806,7 +806,7 @@
         <w:rPr>
           <w:rFonts w:eastAsia="Times New Roman"/>
         </w:rPr>
-        <w:t xml:space="preserve"> characterize the system's response function. The primary targets are (a) the fraction of variance in the system's affective trajectory accounted for by the probe relative to the system's endogenous drivers, and (b) whether the probe's effect appears in features of the trajectory other than the mean, such as variability or decay rate (cf. Section 1.3).</w:t>
+        <w:t xml:space="preserve"> characterize the system’s response function. The primary targets are (a) the fraction of variance in the system’s affective trajectory accounted for by the probe relative to the system’s endogenous drivers, and (b) whether the probe’s effect appears in features of the trajectory other than the mean, such as variability or decay rate (cf. Section 1.3).</w:t>
       </w:r>
     </w:p>
     <w:p>
@@ -993,7 +993,7 @@
         <w:rPr>
           <w:rFonts w:eastAsia="Times New Roman"/>
         </w:rPr>
-        <w:t>1) model with lag-1 alignment uses 53 days, with the first day in the window (Day 18) using Day 17's mood as its lag-</w:t>
+        <w:t>1) model with lag-1 alignment uses 53 days, with the first day in the window (Day 18) using Day 17’s mood as its lag-</w:t>
       </w:r>
       <w:r>
         <w:rPr>
@@ -1072,7 +1072,7 @@
         <w:rPr>
           <w:rFonts w:eastAsia="Times New Roman"/>
         </w:rPr>
-        <w:t xml:space="preserve">The analyses are organized in three tiers. The primary inference runs through the nested autoregressive models, their incremental-R² decomposition, and the equivalence test that bounds the probe's mean effect (Sections 2.5.1, 2.5.4, and 2.5.10); the state-space model and the impulse-response functions (Sections 2.5.2 and 2.5.3) characterize the dynamics that frame that comparison. </w:t>
+        <w:t xml:space="preserve">The analyses are organized in three tiers. The primary inference runs through the nested autoregressive models, their incremental-R² decomposition, and the equivalence test that bounds the probe’s mean effect (Sections 2.5.1, 2.5.4, and 2.5.10); the state-space model and the impulse-response functions (Sections 2.5.2 and 2.5.3) characterize the dynamics that frame that comparison. </w:t>
       </w:r>
       <w:r>
         <w:rPr>
@@ -2298,15 +2298,16 @@
           <w:sz w:val="22"/>
           <w:szCs w:val="22"/>
         </w:rPr>
-        <w:t xml:space="preserve">Figure 1. </w:t>
-      </w:r>
-      <w:r>
-        <w:rPr>
-          <w:rFonts w:eastAsia="Times New Roman"/>
+        <w:t>Figure 1.</w:t>
+      </w:r>
+      <w:r>
+        <w:rPr>
+          <w:rFonts w:eastAsia="Times New Roman"/>
+          <w:bCs/>
           <w:sz w:val="22"/>
           <w:szCs w:val="22"/>
         </w:rPr>
-        <w:t>Daily mean mood across the 70-day window.</w:t>
+        <w:t xml:space="preserve"> Daily mean mood across the 70-day window.</w:t>
       </w:r>
     </w:p>
     <w:p>
@@ -2396,15 +2397,16 @@
           <w:sz w:val="22"/>
           <w:szCs w:val="22"/>
         </w:rPr>
-        <w:t xml:space="preserve">Figure 2. </w:t>
-      </w:r>
-      <w:r>
-        <w:rPr>
-          <w:rFonts w:eastAsia="Times New Roman"/>
+        <w:t>Figure 2.</w:t>
+      </w:r>
+      <w:r>
+        <w:rPr>
+          <w:rFonts w:eastAsia="Times New Roman"/>
+          <w:bCs/>
           <w:sz w:val="22"/>
           <w:szCs w:val="22"/>
         </w:rPr>
-        <w:t>All momentary mood observations with 7-day rolling mean.</w:t>
+        <w:t xml:space="preserve"> All momentary mood observations with 7-day rolling mean.</w:t>
       </w:r>
     </w:p>
     <w:p>
@@ -2574,22 +2576,21 @@
           <w:rFonts w:eastAsia="Times New Roman"/>
           <w:b/>
           <w:bCs/>
-          <w:i/>
           <w:iCs/>
           <w:sz w:val="22"/>
           <w:szCs w:val="22"/>
         </w:rPr>
-        <w:t xml:space="preserve">Table 1. </w:t>
-      </w:r>
-      <w:r>
-        <w:rPr>
-          <w:rFonts w:eastAsia="Times New Roman"/>
-          <w:i/>
+        <w:t>Table 1.</w:t>
+      </w:r>
+      <w:r>
+        <w:rPr>
+          <w:rFonts w:eastAsia="Times New Roman"/>
+          <w:bCs/>
           <w:iCs/>
           <w:sz w:val="22"/>
           <w:szCs w:val="22"/>
         </w:rPr>
-        <w:t>Coefficient estimates for nested autoregressive models of daily mood.</w:t>
+        <w:t xml:space="preserve"> Coefficient estimates for nested autoregressive models of daily mood.</w:t>
       </w:r>
     </w:p>
     <w:tbl>
@@ -4487,33 +4488,18 @@
           <w:sz w:val="22"/>
           <w:szCs w:val="22"/>
         </w:rPr>
-        <w:t xml:space="preserve">Figure 3. </w:t>
-      </w:r>
-      <w:r>
-        <w:rPr>
-          <w:rFonts w:eastAsia="Times New Roman"/>
+        <w:t>Figure 3.</w:t>
+      </w:r>
+      <w:proofErr w:type="gramStart"/>
+      <w:proofErr w:type="gramEnd"/>
+      <w:r>
+        <w:rPr>
+          <w:rFonts w:eastAsia="Times New Roman"/>
+          <w:bCs/>
           <w:sz w:val="22"/>
           <w:szCs w:val="22"/>
         </w:rPr>
-        <w:t xml:space="preserve">Incremental R² for each predictor in the </w:t>
-      </w:r>
-      <w:proofErr w:type="gramStart"/>
-      <w:r>
-        <w:rPr>
-          <w:rFonts w:eastAsia="Times New Roman"/>
-          <w:sz w:val="22"/>
-          <w:szCs w:val="22"/>
-        </w:rPr>
-        <w:t>AR(</w:t>
-      </w:r>
-      <w:proofErr w:type="gramEnd"/>
-      <w:r>
-        <w:rPr>
-          <w:rFonts w:eastAsia="Times New Roman"/>
-          <w:sz w:val="22"/>
-          <w:szCs w:val="22"/>
-        </w:rPr>
-        <w:t>1) model.</w:t>
+        <w:t xml:space="preserve"> Incremental R² for each predictor in the AR(1) model.</w:t>
       </w:r>
     </w:p>
     <w:p>
@@ -4702,15 +4688,16 @@
           <w:sz w:val="22"/>
           <w:szCs w:val="22"/>
         </w:rPr>
-        <w:t xml:space="preserve">Figure 4. </w:t>
-      </w:r>
-      <w:r>
-        <w:rPr>
-          <w:rFonts w:eastAsia="Times New Roman"/>
+        <w:t>Figure 4.</w:t>
+      </w:r>
+      <w:r>
+        <w:rPr>
+          <w:rFonts w:eastAsia="Times New Roman"/>
+          <w:bCs/>
           <w:sz w:val="22"/>
           <w:szCs w:val="22"/>
         </w:rPr>
-        <w:t>Between-condition comparison of daily mood, agency, and metacognition.</w:t>
+        <w:t xml:space="preserve"> Between-condition comparison of daily mood, agency, and metacognition.</w:t>
       </w:r>
     </w:p>
     <w:p>
@@ -5022,14 +5009,14 @@
         <w:rPr>
           <w:rFonts w:eastAsia="Times New Roman"/>
         </w:rPr>
-        <w:t xml:space="preserve">The most direct empirical question, whether melatonin shifts average daily mood, yielded a small and statistically non-significant mean difference. The evidential question set out in Section 2.3 is how the probe's contribution compares in magnitude with the system's endogenous drivers. The drop-one decomposition in Section 3.2 answers it directly: agency's unique contribution was 19.6% of daily-mood variance, and the </w:t>
+        <w:t xml:space="preserve">The most direct empirical question, whether melatonin shifts average daily mood, yielded a small and statistically non-significant mean difference. The evidential question set out in Section 2.3 is how the probe’s contribution compares in magnitude with the system’s endogenous drivers. The drop-one decomposition in Section 3.2 answers it directly: agency’s unique contribution was 19.6% of daily-mood variance, and the </w:t>
       </w:r>
       <w:proofErr w:type="gramStart"/>
       <w:r>
         <w:rPr>
           <w:rFonts w:eastAsia="Times New Roman"/>
         </w:rPr>
-        <w:t>probe's</w:t>
+        <w:t>probe’s</w:t>
       </w:r>
       <w:proofErr w:type="gramEnd"/>
       <w:r>
@@ -6156,28 +6143,24 @@
         <w:rPr>
           <w:rFonts w:eastAsia="Times New Roman"/>
         </w:rPr>
-        <w:t>Knapen</w:t>
+        <w:t xml:space="preserve">Knapen, S. E., Snippe, E., Smit, A. C., Schoevers, R. A., &amp; Riemersma-van der Lek, R. F. (2025). Sleep disturbances in the prodromal phase of mood episodes in patients with bipolar disorder: A replicated single-case design. </w:t>
       </w:r>
       <w:proofErr w:type="spellEnd"/>
-      <w:r>
-        <w:rPr>
-          <w:rFonts w:eastAsia="Times New Roman"/>
-        </w:rPr>
-        <w:t xml:space="preserve">, S. E., </w:t>
-      </w:r>
       <w:proofErr w:type="spellStart"/>
-      <w:r>
-        <w:rPr>
-          <w:rFonts w:eastAsia="Times New Roman"/>
-        </w:rPr>
-        <w:t>Snippe</w:t>
-      </w:r>
       <w:proofErr w:type="spellEnd"/>
       <w:r>
         <w:rPr>
           <w:rFonts w:eastAsia="Times New Roman"/>
-        </w:rPr>
-        <w:t>, E., Smit, A. C., Schoevers, R. A., &amp; Riemersma-van der Lek, R. F. (2025). Sleep disturbances in the prodromal phase of mood episodes in patients with bipolar disorder: A replicated single-case design. Journal for Person-Oriented Research, 11(3), 142-168. https://doi.org/10.17505/jpor.2025.28202</w:t>
+          <w:i/>
+        </w:rPr>
+        <w:t>Journal for Person-Oriented Research, 11</w:t>
+      </w:r>
+      <w:r>
+        <w:rPr>
+          <w:rFonts w:eastAsia="Times New Roman"/>
+          <w:i w:val="0"/>
+        </w:rPr>
+        <w:t>(3), 142–168. https://doi.org/10.17505/jpor.2025.28202</w:t>
       </w:r>
     </w:p>
     <w:p>
@@ -6826,7 +6809,16 @@
           <w:sz w:val="22"/>
           <w:szCs w:val="22"/>
         </w:rPr>
-        <w:t>Figure A.1. Lag-1 autocorrelation of daily mood across the 70-day sample.</w:t>
+        <w:t>Figure A.1.</w:t>
+      </w:r>
+      <w:r>
+        <w:rPr>
+          <w:rFonts w:eastAsia="Times New Roman"/>
+          <w:bCs/>
+          <w:sz w:val="22"/>
+          <w:szCs w:val="22"/>
+        </w:rPr>
+        <w:t xml:space="preserve"> Lag-1 autocorrelation of daily mood across the 70-day sample.</w:t>
       </w:r>
     </w:p>
     <w:p>
@@ -6933,7 +6925,16 @@
           <w:sz w:val="22"/>
           <w:szCs w:val="22"/>
         </w:rPr>
-        <w:t>Figure A.2. Impulse response and half-life of an affective perturbation.</w:t>
+        <w:t>Figure A.2.</w:t>
+      </w:r>
+      <w:r>
+        <w:rPr>
+          <w:rFonts w:eastAsia="Times New Roman"/>
+          <w:bCs/>
+          <w:sz w:val="22"/>
+          <w:szCs w:val="22"/>
+        </w:rPr>
+        <w:t xml:space="preserve"> Impulse response and half-life of an affective perturbation.</w:t>
       </w:r>
     </w:p>
     <w:p>
@@ -7089,7 +7090,16 @@
           <w:sz w:val="22"/>
           <w:szCs w:val="22"/>
         </w:rPr>
-        <w:t>Figure A.3. Kalman-smoothed latent affective state across the 70-day window.</w:t>
+        <w:t>Figure A.3.</w:t>
+      </w:r>
+      <w:r>
+        <w:rPr>
+          <w:rFonts w:eastAsia="Times New Roman"/>
+          <w:bCs/>
+          <w:sz w:val="22"/>
+          <w:szCs w:val="22"/>
+        </w:rPr>
+        <w:t xml:space="preserve"> Kalman-smoothed latent affective state across the 70-day window.</w:t>
       </w:r>
     </w:p>
     <w:p>
@@ -7163,30 +7173,18 @@
           <w:sz w:val="22"/>
           <w:szCs w:val="22"/>
         </w:rPr>
-        <w:lastRenderedPageBreak/>
-        <w:t xml:space="preserve">Table B.1. </w:t>
+        <w:t>Table B.1.</w:t>
       </w:r>
       <w:proofErr w:type="gramStart"/>
-      <w:r>
-        <w:rPr>
-          <w:rFonts w:eastAsia="Times New Roman"/>
-          <w:b/>
+      <w:proofErr w:type="gramEnd"/>
+      <w:r>
+        <w:rPr>
+          <w:rFonts w:eastAsia="Times New Roman"/>
           <w:bCs/>
           <w:sz w:val="22"/>
           <w:szCs w:val="22"/>
         </w:rPr>
-        <w:t>Fixed-effect</w:t>
-      </w:r>
-      <w:proofErr w:type="gramEnd"/>
-      <w:r>
-        <w:rPr>
-          <w:rFonts w:eastAsia="Times New Roman"/>
-          <w:b/>
-          <w:bCs/>
-          <w:sz w:val="22"/>
-          <w:szCs w:val="22"/>
-        </w:rPr>
-        <w:t xml:space="preserve"> estimates for the multilevel model of momentary mood.</w:t>
+        <w:t xml:space="preserve"> Fixed-effect estimates for the multilevel model of momentary mood.</w:t>
       </w:r>
     </w:p>
     <w:tbl>

</xml_diff>

<commit_message>
refresh the submission figures and files
</commit_message>
<xml_diff>
--- a/paper/paper_submission_2026-08-13.docx
+++ b/paper/paper_submission_2026-08-13.docx
@@ -2242,7 +2242,7 @@
         </w:rPr>
         <w:drawing>
           <wp:inline distT="0" distB="0" distL="0" distR="0" wp14:anchorId="2CA580AB" wp14:editId="6445EEDE">
-            <wp:extent cx="5138208" cy="2245587"/>
+            <wp:extent cx="5138014" cy="2226473"/>
             <wp:effectExtent l="0" t="0" r="0" b="0"/>
             <wp:docPr id="1" name="fig1_daily_mood_timeseries.png" descr="Daily mean mood across the 70-day window. Each dot represents the average of up to three EMA observations on that day, colored by daily condition. The light gray line connects daily means; the dotted vertical line at Day 18 marks the point at which agency and metacognition items were added to the protocol." title="Figure 1"/>
             <wp:cNvGraphicFramePr>
@@ -2267,7 +2267,7 @@
                   <pic:spPr bwMode="auto">
                     <a:xfrm>
                       <a:off x="0" y="0"/>
-                      <a:ext cx="5138208" cy="2245587"/>
+                      <a:ext cx="5138014" cy="2226473"/>
                     </a:xfrm>
                     <a:prstGeom prst="rect">
                       <a:avLst/>
@@ -2341,7 +2341,7 @@
         <w:lastRenderedPageBreak/>
         <w:drawing>
           <wp:inline distT="0" distB="0" distL="0" distR="0" wp14:anchorId="69E9B72D" wp14:editId="46253534">
-            <wp:extent cx="5138208" cy="2245587"/>
+            <wp:extent cx="5138014" cy="2226473"/>
             <wp:effectExtent l="0" t="0" r="0" b="0"/>
             <wp:docPr id="737024883" name="fig2_ema_timeseries.png" descr="All 195 momentary mood observations across the 70-day window, colored by daily condition. The dark line shows the 7-day rolling mean of daily mood, indicating a gradual upward trend that stabilizes from approximately Day 40 onward." title="Figure 2"/>
             <wp:cNvGraphicFramePr>
@@ -2366,7 +2366,7 @@
                   <pic:spPr bwMode="auto">
                     <a:xfrm>
                       <a:off x="0" y="0"/>
-                      <a:ext cx="5138208" cy="2245587"/>
+                      <a:ext cx="5138014" cy="2226473"/>
                     </a:xfrm>
                     <a:prstGeom prst="rect">
                       <a:avLst/>
@@ -4432,7 +4432,7 @@
         </w:rPr>
         <w:drawing>
           <wp:inline distT="0" distB="0" distL="0" distR="0" wp14:anchorId="1C76EF66" wp14:editId="19CAD7ED">
-            <wp:extent cx="5138208" cy="3043016"/>
+            <wp:extent cx="5138014" cy="2431993"/>
             <wp:effectExtent l="0" t="0" r="0" b="0"/>
             <wp:docPr id="501947768" name="fig7_delta_r2_DRAFT.png" descr="Incremental R² for each predictor in the full AR(1)-with-exogenous-inputs model, computed as the drop in R² when that predictor is removed. Agency and metacognition together account for over half of the day-to-day variance in mood; the melatonin probe accounts for essentially none." title="Figure 3"/>
             <wp:cNvGraphicFramePr>
@@ -4457,7 +4457,7 @@
                   <pic:spPr bwMode="auto">
                     <a:xfrm>
                       <a:off x="0" y="0"/>
-                      <a:ext cx="5138208" cy="3043016"/>
+                      <a:ext cx="5138014" cy="2431993"/>
                     </a:xfrm>
                     <a:prstGeom prst="rect">
                       <a:avLst/>
@@ -4632,7 +4632,7 @@
         </w:rPr>
         <w:drawing>
           <wp:inline distT="0" distB="0" distL="0" distR="0" wp14:anchorId="15CA5799" wp14:editId="0E8F3A6A">
-            <wp:extent cx="5138208" cy="2135666"/>
+            <wp:extent cx="5138014" cy="2431993"/>
             <wp:effectExtent l="0" t="0" r="0" b="0"/>
             <wp:docPr id="1261128341" name="fig3_condition_comparison.png" descr="Between-condition comparison of daily mood, agency, and metacognition. Boxes show interquartile range; horizontal lines show medians; jittered points show individual days. Mean differences (melatonin minus control) are annotated above each panel and are small for all three variables." title="Figure 4"/>
             <wp:cNvGraphicFramePr>
@@ -4657,7 +4657,7 @@
                   <pic:spPr bwMode="auto">
                     <a:xfrm>
                       <a:off x="0" y="0"/>
-                      <a:ext cx="5138208" cy="2135666"/>
+                      <a:ext cx="5138014" cy="2431993"/>
                     </a:xfrm>
                     <a:prstGeom prst="rect">
                       <a:avLst/>
@@ -6739,7 +6739,7 @@
         </w:rPr>
         <w:drawing>
           <wp:inline distT="0" distB="0" distL="0" distR="0" wp14:anchorId="27C09FF8" wp14:editId="23C5AE0F">
-            <wp:extent cx="3043016" cy="3043016"/>
+            <wp:extent cx="3043123" cy="3043123"/>
             <wp:effectExtent l="0" t="0" r="0" b="0"/>
             <wp:docPr id="1472181978" name="Figure A1" descr="Lag-1 autocorrelation of daily mood across the 70-day sample." title="Figure A1"/>
             <wp:cNvGraphicFramePr>
@@ -6764,7 +6764,7 @@
                   <pic:spPr>
                     <a:xfrm>
                       <a:off x="0" y="0"/>
-                      <a:ext cx="3043016" cy="3043016"/>
+                      <a:ext cx="3043123" cy="3043123"/>
                     </a:xfrm>
                     <a:prstGeom prst="rect">
                       <a:avLst/>
@@ -6855,7 +6855,7 @@
         <w:lastRenderedPageBreak/>
         <w:drawing>
           <wp:inline distT="0" distB="0" distL="0" distR="0" wp14:anchorId="71B33B6E" wp14:editId="03FBDDD4">
-            <wp:extent cx="5138208" cy="3043016"/>
+            <wp:extent cx="5138014" cy="2431993"/>
             <wp:effectExtent l="0" t="0" r="0" b="0"/>
             <wp:docPr id="1004438122" name="Figure A2" descr="Impulse response and half-life of an affective perturbation." title="Figure A2"/>
             <wp:cNvGraphicFramePr>
@@ -6880,7 +6880,7 @@
                   <pic:spPr>
                     <a:xfrm>
                       <a:off x="0" y="0"/>
-                      <a:ext cx="5138208" cy="3043016"/>
+                      <a:ext cx="5138014" cy="2431993"/>
                     </a:xfrm>
                     <a:prstGeom prst="rect">
                       <a:avLst/>
@@ -7020,7 +7020,7 @@
         <w:lastRenderedPageBreak/>
         <w:drawing>
           <wp:inline distT="0" distB="0" distL="0" distR="0" wp14:anchorId="7079D306" wp14:editId="0CA17230">
-            <wp:extent cx="5138208" cy="3043016"/>
+            <wp:extent cx="5138014" cy="2329233"/>
             <wp:effectExtent l="0" t="0" r="0" b="0"/>
             <wp:docPr id="2069361368" name="Figure A3" descr="Kalman-smoothed latent affective state across the 70-day window." title="Figure A3"/>
             <wp:cNvGraphicFramePr>
@@ -7045,7 +7045,7 @@
                   <pic:spPr>
                     <a:xfrm>
                       <a:off x="0" y="0"/>
-                      <a:ext cx="5138208" cy="3043016"/>
+                      <a:ext cx="5138014" cy="2329233"/>
                     </a:xfrm>
                     <a:prstGeom prst="rect">
                       <a:avLst/>
@@ -7144,6 +7144,7 @@
     <w:p>
       <w:pPr>
         <w:spacing w:before="60" w:after="60" w:line="480" w:lineRule="auto"/>
+        <w:keepNext/>
       </w:pPr>
       <w:r>
         <w:rPr>

</xml_diff>